<commit_message>
Adding help button and glossary
</commit_message>
<xml_diff>
--- a/docs/Manual de Ususario Sistema Experto.docx
+++ b/docs/Manual de Ususario Sistema Experto.docx
@@ -206,7 +206,27 @@
           <w:sz w:val="24"/>
           <w:szCs w:val="24"/>
         </w:rPr>
-        <w:t>Manual de usuario del Sistema Experto para la identificación de Filum de especies.</w:t>
+        <w:t xml:space="preserve">Manual de usuario del Sistema Experto para la identificación de </w:t>
+      </w:r>
+      <w:proofErr w:type="spellStart"/>
+      <w:r>
+        <w:rPr>
+          <w:rFonts w:ascii="Times New Roman" w:hAnsi="Times New Roman" w:cs="Times New Roman"/>
+          <w:b/>
+          <w:sz w:val="24"/>
+          <w:szCs w:val="24"/>
+        </w:rPr>
+        <w:t>Phyla</w:t>
+      </w:r>
+      <w:proofErr w:type="spellEnd"/>
+      <w:r>
+        <w:rPr>
+          <w:rFonts w:ascii="Times New Roman" w:hAnsi="Times New Roman" w:cs="Times New Roman"/>
+          <w:b/>
+          <w:sz w:val="24"/>
+          <w:szCs w:val="24"/>
+        </w:rPr>
+        <w:t xml:space="preserve"> de especies.</w:t>
       </w:r>
     </w:p>
     <w:p>
@@ -671,7 +691,43 @@
           <w:sz w:val="24"/>
           <w:szCs w:val="24"/>
         </w:rPr>
-        <w:t>El sistema que se presenta a continuación es un sistema experto tradicional enfocado en la identificación de fílum de especies mediante características ingresadas en la “Base de conocimientos” del sistema. Nuestro sistema carga estas características y, utilizando reglas, puede identificar a qué fílum pertenecen, proporcionánd</w:t>
+        <w:t xml:space="preserve">El sistema que se presenta a continuación es un sistema experto tradicional enfocado en la identificación de </w:t>
+      </w:r>
+      <w:proofErr w:type="spellStart"/>
+      <w:r>
+        <w:rPr>
+          <w:rFonts w:ascii="Times New Roman" w:hAnsi="Times New Roman" w:cs="Times New Roman"/>
+          <w:sz w:val="24"/>
+          <w:szCs w:val="24"/>
+        </w:rPr>
+        <w:t>phylum</w:t>
+      </w:r>
+      <w:proofErr w:type="spellEnd"/>
+      <w:r>
+        <w:rPr>
+          <w:rFonts w:ascii="Times New Roman" w:hAnsi="Times New Roman" w:cs="Times New Roman"/>
+          <w:sz w:val="24"/>
+          <w:szCs w:val="24"/>
+        </w:rPr>
+        <w:t xml:space="preserve"> de especies mediante características ingresadas en la “Base de conocimientos” del sistema. Nuestro sistema carga estas características y, utilizando reglas, puede identificar a qué </w:t>
+      </w:r>
+      <w:proofErr w:type="spellStart"/>
+      <w:r>
+        <w:rPr>
+          <w:rFonts w:ascii="Times New Roman" w:hAnsi="Times New Roman" w:cs="Times New Roman"/>
+          <w:sz w:val="24"/>
+          <w:szCs w:val="24"/>
+        </w:rPr>
+        <w:t>phylum</w:t>
+      </w:r>
+      <w:proofErr w:type="spellEnd"/>
+      <w:r>
+        <w:rPr>
+          <w:rFonts w:ascii="Times New Roman" w:hAnsi="Times New Roman" w:cs="Times New Roman"/>
+          <w:sz w:val="24"/>
+          <w:szCs w:val="24"/>
+        </w:rPr>
+        <w:t xml:space="preserve"> pertenecen, proporcionánd</w:t>
       </w:r>
       <w:r>
         <w:rPr>
@@ -696,32 +752,104 @@
           <w:sz w:val="24"/>
           <w:szCs w:val="24"/>
         </w:rPr>
-        <w:t>La interfaz de usuario estándar permite la consulta, adición de características y adición de fílum, entre otras opciones. Este sistema es muy versátil, ya que no se limita únicamente a la identificación de fílum de especies. Dependiendo de la base de datos de usuario que se cargue, el sistema interpreta las características y las utiliza para evaluarlas según las reglas. Estas proposiciones lógicas se utilizan para modelar conocimiento y tomar decisiones, resultando en la iden</w:t>
-      </w:r>
-      <w:r>
-        <w:rPr>
-          <w:rFonts w:ascii="Times New Roman" w:hAnsi="Times New Roman" w:cs="Times New Roman"/>
-          <w:sz w:val="24"/>
-          <w:szCs w:val="24"/>
-        </w:rPr>
-        <w:t>tificación del fílum ingresado.</w:t>
-      </w:r>
-    </w:p>
-    <w:p>
-      <w:pPr>
-        <w:rPr>
-          <w:rFonts w:ascii="Times New Roman" w:hAnsi="Times New Roman" w:cs="Times New Roman"/>
-          <w:sz w:val="24"/>
-          <w:szCs w:val="24"/>
-        </w:rPr>
-      </w:pPr>
-      <w:r>
-        <w:rPr>
-          <w:rFonts w:ascii="Times New Roman" w:hAnsi="Times New Roman" w:cs="Times New Roman"/>
-          <w:sz w:val="24"/>
-          <w:szCs w:val="24"/>
-        </w:rPr>
-        <w:t>Siguiendo el formato del archivo example.json incluido en nuestro sistema, puedes aplicar el sistema experto en distintas áreas de desarrollo. Así, no solo se limita a la identificación de fílum de especies, sino que también es un sistema experto versátil, ampliando su usabilidad.</w:t>
+        <w:t xml:space="preserve">La interfaz de usuario estándar permite la consulta, adición de características y adición de </w:t>
+      </w:r>
+      <w:proofErr w:type="spellStart"/>
+      <w:r>
+        <w:rPr>
+          <w:rFonts w:ascii="Times New Roman" w:hAnsi="Times New Roman" w:cs="Times New Roman"/>
+          <w:sz w:val="24"/>
+          <w:szCs w:val="24"/>
+        </w:rPr>
+        <w:t>phylum</w:t>
+      </w:r>
+      <w:proofErr w:type="spellEnd"/>
+      <w:r>
+        <w:rPr>
+          <w:rFonts w:ascii="Times New Roman" w:hAnsi="Times New Roman" w:cs="Times New Roman"/>
+          <w:sz w:val="24"/>
+          <w:szCs w:val="24"/>
+        </w:rPr>
+        <w:t xml:space="preserve">, entre otras opciones. Este sistema es muy versátil, ya que no se limita únicamente a la identificación de </w:t>
+      </w:r>
+      <w:proofErr w:type="spellStart"/>
+      <w:r>
+        <w:rPr>
+          <w:rFonts w:ascii="Times New Roman" w:hAnsi="Times New Roman" w:cs="Times New Roman"/>
+          <w:sz w:val="24"/>
+          <w:szCs w:val="24"/>
+        </w:rPr>
+        <w:t>phylum</w:t>
+      </w:r>
+      <w:proofErr w:type="spellEnd"/>
+      <w:r>
+        <w:rPr>
+          <w:rFonts w:ascii="Times New Roman" w:hAnsi="Times New Roman" w:cs="Times New Roman"/>
+          <w:sz w:val="24"/>
+          <w:szCs w:val="24"/>
+        </w:rPr>
+        <w:t xml:space="preserve"> de especies. Dependiendo de la base de datos de usuario que se cargue, el sistema interpreta las características y las utiliza para evaluarlas según las reglas. Estas proposiciones lógicas se utilizan para modelar conocimiento y tomar decisiones, resultando en la iden</w:t>
+      </w:r>
+      <w:r>
+        <w:rPr>
+          <w:rFonts w:ascii="Times New Roman" w:hAnsi="Times New Roman" w:cs="Times New Roman"/>
+          <w:sz w:val="24"/>
+          <w:szCs w:val="24"/>
+        </w:rPr>
+        <w:t xml:space="preserve">tificación del </w:t>
+      </w:r>
+      <w:proofErr w:type="spellStart"/>
+      <w:r>
+        <w:rPr>
+          <w:rFonts w:ascii="Times New Roman" w:hAnsi="Times New Roman" w:cs="Times New Roman"/>
+          <w:sz w:val="24"/>
+          <w:szCs w:val="24"/>
+        </w:rPr>
+        <w:t>phylum</w:t>
+      </w:r>
+      <w:proofErr w:type="spellEnd"/>
+      <w:r>
+        <w:rPr>
+          <w:rFonts w:ascii="Times New Roman" w:hAnsi="Times New Roman" w:cs="Times New Roman"/>
+          <w:sz w:val="24"/>
+          <w:szCs w:val="24"/>
+        </w:rPr>
+        <w:t xml:space="preserve"> ingresado.</w:t>
+      </w:r>
+    </w:p>
+    <w:p>
+      <w:pPr>
+        <w:rPr>
+          <w:rFonts w:ascii="Times New Roman" w:hAnsi="Times New Roman" w:cs="Times New Roman"/>
+          <w:sz w:val="24"/>
+          <w:szCs w:val="24"/>
+        </w:rPr>
+      </w:pPr>
+      <w:r>
+        <w:rPr>
+          <w:rFonts w:ascii="Times New Roman" w:hAnsi="Times New Roman" w:cs="Times New Roman"/>
+          <w:sz w:val="24"/>
+          <w:szCs w:val="24"/>
+        </w:rPr>
+        <w:t xml:space="preserve">Siguiendo el formato del archivo example.json incluido en nuestro sistema, puedes aplicar el sistema experto en distintas áreas de desarrollo. Así, no solo se limita a la identificación de </w:t>
+      </w:r>
+      <w:proofErr w:type="spellStart"/>
+      <w:r>
+        <w:rPr>
+          <w:rFonts w:ascii="Times New Roman" w:hAnsi="Times New Roman" w:cs="Times New Roman"/>
+          <w:sz w:val="24"/>
+          <w:szCs w:val="24"/>
+        </w:rPr>
+        <w:t>phylum</w:t>
+      </w:r>
+      <w:proofErr w:type="spellEnd"/>
+      <w:r>
+        <w:rPr>
+          <w:rFonts w:ascii="Times New Roman" w:hAnsi="Times New Roman" w:cs="Times New Roman"/>
+          <w:sz w:val="24"/>
+          <w:szCs w:val="24"/>
+        </w:rPr>
+        <w:t xml:space="preserve"> de especies, sino que también es un sistema experto versátil, ampliando su usabilidad.</w:t>
       </w:r>
     </w:p>
     <w:p>
@@ -1286,8 +1414,6 @@
         </w:rPr>
         <w:t>los siguientes paso</w:t>
       </w:r>
-      <w:bookmarkStart w:id="0" w:name="_GoBack"/>
-      <w:bookmarkEnd w:id="0"/>
       <w:r>
         <w:rPr>
           <w:rFonts w:ascii="Times New Roman" w:hAnsi="Times New Roman" w:cs="Times New Roman"/>
@@ -1361,9 +1487,10 @@
       <w:r>
         <w:rPr>
           <w:rFonts w:ascii="Times New Roman" w:hAnsi="Times New Roman" w:cs="Times New Roman"/>
-          <w:sz w:val="24"/>
-          <w:szCs w:val="24"/>
-          <w:lang w:val="es-ES"/>
+          <w:noProof/>
+          <w:sz w:val="24"/>
+          <w:szCs w:val="24"/>
+          <w:lang w:val="es-ES" w:eastAsia="es-ES"/>
         </w:rPr>
         <w:drawing>
           <wp:inline distT="0" distB="0" distL="0" distR="0" wp14:anchorId="05239205" wp14:editId="36DBF471">
@@ -1466,9 +1593,10 @@
       <w:r>
         <w:rPr>
           <w:rFonts w:ascii="Times New Roman" w:hAnsi="Times New Roman" w:cs="Times New Roman"/>
-          <w:sz w:val="24"/>
-          <w:szCs w:val="24"/>
-          <w:lang w:val="es-ES"/>
+          <w:noProof/>
+          <w:sz w:val="24"/>
+          <w:szCs w:val="24"/>
+          <w:lang w:val="es-ES" w:eastAsia="es-ES"/>
         </w:rPr>
         <w:lastRenderedPageBreak/>
         <w:drawing>
@@ -1528,9 +1656,10 @@
       <w:r>
         <w:rPr>
           <w:rFonts w:ascii="Times New Roman" w:hAnsi="Times New Roman" w:cs="Times New Roman"/>
-          <w:sz w:val="24"/>
-          <w:szCs w:val="24"/>
-          <w:lang w:val="es-ES"/>
+          <w:noProof/>
+          <w:sz w:val="24"/>
+          <w:szCs w:val="24"/>
+          <w:lang w:val="es-ES" w:eastAsia="es-ES"/>
         </w:rPr>
         <w:drawing>
           <wp:inline distT="0" distB="0" distL="0" distR="0" wp14:anchorId="199A6F95" wp14:editId="20C4667E">
@@ -2069,7 +2198,67 @@
           <w:lang w:val="es-ES"/>
         </w:rPr>
         <w:br/>
-        <w:t>En esta opción podemos visualizar los Filum cargados al sistema, agregar nuevos Filum o agregarle características a los Filum ya existentes.</w:t>
+        <w:t xml:space="preserve">En esta opción podemos visualizar los </w:t>
+      </w:r>
+      <w:proofErr w:type="spellStart"/>
+      <w:r>
+        <w:rPr>
+          <w:rFonts w:ascii="Times New Roman" w:hAnsi="Times New Roman" w:cs="Times New Roman"/>
+          <w:sz w:val="24"/>
+          <w:szCs w:val="24"/>
+          <w:lang w:val="es-ES"/>
+        </w:rPr>
+        <w:t>Phylum</w:t>
+      </w:r>
+      <w:proofErr w:type="spellEnd"/>
+      <w:r>
+        <w:rPr>
+          <w:rFonts w:ascii="Times New Roman" w:hAnsi="Times New Roman" w:cs="Times New Roman"/>
+          <w:sz w:val="24"/>
+          <w:szCs w:val="24"/>
+          <w:lang w:val="es-ES"/>
+        </w:rPr>
+        <w:t xml:space="preserve"> cargados al sistema, agregar nuevos </w:t>
+      </w:r>
+      <w:proofErr w:type="spellStart"/>
+      <w:r>
+        <w:rPr>
+          <w:rFonts w:ascii="Times New Roman" w:hAnsi="Times New Roman" w:cs="Times New Roman"/>
+          <w:sz w:val="24"/>
+          <w:szCs w:val="24"/>
+          <w:lang w:val="es-ES"/>
+        </w:rPr>
+        <w:t>Phylum</w:t>
+      </w:r>
+      <w:proofErr w:type="spellEnd"/>
+      <w:r>
+        <w:rPr>
+          <w:rFonts w:ascii="Times New Roman" w:hAnsi="Times New Roman" w:cs="Times New Roman"/>
+          <w:sz w:val="24"/>
+          <w:szCs w:val="24"/>
+          <w:lang w:val="es-ES"/>
+        </w:rPr>
+        <w:t xml:space="preserve"> o agregarle características a los </w:t>
+      </w:r>
+      <w:proofErr w:type="spellStart"/>
+      <w:r>
+        <w:rPr>
+          <w:rFonts w:ascii="Times New Roman" w:hAnsi="Times New Roman" w:cs="Times New Roman"/>
+          <w:sz w:val="24"/>
+          <w:szCs w:val="24"/>
+          <w:lang w:val="es-ES"/>
+        </w:rPr>
+        <w:t>Phylum</w:t>
+      </w:r>
+      <w:proofErr w:type="spellEnd"/>
+      <w:r>
+        <w:rPr>
+          <w:rFonts w:ascii="Times New Roman" w:hAnsi="Times New Roman" w:cs="Times New Roman"/>
+          <w:sz w:val="24"/>
+          <w:szCs w:val="24"/>
+          <w:lang w:val="es-ES"/>
+        </w:rPr>
+        <w:t xml:space="preserve"> ya existentes.</w:t>
       </w:r>
       <w:r>
         <w:rPr>
@@ -2148,7 +2337,47 @@
           <w:lang w:val="es-ES"/>
         </w:rPr>
         <w:br/>
-        <w:t>Aca se puede visualizar el apartado de la vista de la base de conocimientos, los inputs del nombre del filum, característica y el nombre para agregar. Al apretar el símbolo + de cada filum podemos ver las características cargadas.</w:t>
+        <w:t xml:space="preserve">Aca se puede visualizar el apartado de la vista de la base de conocimientos, los inputs del nombre del </w:t>
+      </w:r>
+      <w:proofErr w:type="spellStart"/>
+      <w:r>
+        <w:rPr>
+          <w:rFonts w:ascii="Times New Roman" w:hAnsi="Times New Roman" w:cs="Times New Roman"/>
+          <w:sz w:val="24"/>
+          <w:szCs w:val="24"/>
+          <w:lang w:val="es-ES"/>
+        </w:rPr>
+        <w:t>phylum</w:t>
+      </w:r>
+      <w:proofErr w:type="spellEnd"/>
+      <w:r>
+        <w:rPr>
+          <w:rFonts w:ascii="Times New Roman" w:hAnsi="Times New Roman" w:cs="Times New Roman"/>
+          <w:sz w:val="24"/>
+          <w:szCs w:val="24"/>
+          <w:lang w:val="es-ES"/>
+        </w:rPr>
+        <w:t xml:space="preserve">, característica y el nombre para agregar. Al apretar el símbolo + de cada </w:t>
+      </w:r>
+      <w:proofErr w:type="spellStart"/>
+      <w:r>
+        <w:rPr>
+          <w:rFonts w:ascii="Times New Roman" w:hAnsi="Times New Roman" w:cs="Times New Roman"/>
+          <w:sz w:val="24"/>
+          <w:szCs w:val="24"/>
+          <w:lang w:val="es-ES"/>
+        </w:rPr>
+        <w:t>phylum</w:t>
+      </w:r>
+      <w:proofErr w:type="spellEnd"/>
+      <w:r>
+        <w:rPr>
+          <w:rFonts w:ascii="Times New Roman" w:hAnsi="Times New Roman" w:cs="Times New Roman"/>
+          <w:sz w:val="24"/>
+          <w:szCs w:val="24"/>
+          <w:lang w:val="es-ES"/>
+        </w:rPr>
+        <w:t xml:space="preserve"> podemos ver las características cargadas.</w:t>
       </w:r>
       <w:r>
         <w:rPr>
@@ -2260,7 +2489,47 @@
           <w:lang w:val="es-ES"/>
         </w:rPr>
         <w:lastRenderedPageBreak/>
-        <w:t>referente a los filum, evaluando las reglas ya cargadas para dar una respuesta coherente de acuerdo a las características ingresadas del filum.</w:t>
+        <w:t xml:space="preserve">referente a los </w:t>
+      </w:r>
+      <w:proofErr w:type="spellStart"/>
+      <w:r>
+        <w:rPr>
+          <w:rFonts w:ascii="Times New Roman" w:hAnsi="Times New Roman" w:cs="Times New Roman"/>
+          <w:sz w:val="24"/>
+          <w:szCs w:val="24"/>
+          <w:lang w:val="es-ES"/>
+        </w:rPr>
+        <w:t>phylum</w:t>
+      </w:r>
+      <w:proofErr w:type="spellEnd"/>
+      <w:r>
+        <w:rPr>
+          <w:rFonts w:ascii="Times New Roman" w:hAnsi="Times New Roman" w:cs="Times New Roman"/>
+          <w:sz w:val="24"/>
+          <w:szCs w:val="24"/>
+          <w:lang w:val="es-ES"/>
+        </w:rPr>
+        <w:t xml:space="preserve">, evaluando las reglas ya cargadas para dar una respuesta coherente de acuerdo a las características ingresadas del </w:t>
+      </w:r>
+      <w:proofErr w:type="spellStart"/>
+      <w:r>
+        <w:rPr>
+          <w:rFonts w:ascii="Times New Roman" w:hAnsi="Times New Roman" w:cs="Times New Roman"/>
+          <w:sz w:val="24"/>
+          <w:szCs w:val="24"/>
+          <w:lang w:val="es-ES"/>
+        </w:rPr>
+        <w:t>phylum</w:t>
+      </w:r>
+      <w:proofErr w:type="spellEnd"/>
+      <w:r>
+        <w:rPr>
+          <w:rFonts w:ascii="Times New Roman" w:hAnsi="Times New Roman" w:cs="Times New Roman"/>
+          <w:sz w:val="24"/>
+          <w:szCs w:val="24"/>
+          <w:lang w:val="es-ES"/>
+        </w:rPr>
+        <w:t>.</w:t>
       </w:r>
       <w:r>
         <w:rPr>
@@ -2426,7 +2695,27 @@
           <w:lang w:val="es-ES"/>
         </w:rPr>
         <w:lastRenderedPageBreak/>
-        <w:t>sistema evaluara mediante reglas y dará una respuesta simulando el comportamiento de un experto. Al terminar de indicarle que características presenta el Filum el evaluara cual es el que coincide y dará como resultado su descripción y una recopilación de las características que se le dio.</w:t>
+        <w:t xml:space="preserve">sistema evaluara mediante reglas y dará una respuesta simulando el comportamiento de un experto. Al terminar de indicarle que características presenta el </w:t>
+      </w:r>
+      <w:proofErr w:type="spellStart"/>
+      <w:r>
+        <w:rPr>
+          <w:rFonts w:ascii="Times New Roman" w:hAnsi="Times New Roman" w:cs="Times New Roman"/>
+          <w:sz w:val="24"/>
+          <w:szCs w:val="24"/>
+          <w:lang w:val="es-ES"/>
+        </w:rPr>
+        <w:t>Phylum</w:t>
+      </w:r>
+      <w:proofErr w:type="spellEnd"/>
+      <w:r>
+        <w:rPr>
+          <w:rFonts w:ascii="Times New Roman" w:hAnsi="Times New Roman" w:cs="Times New Roman"/>
+          <w:sz w:val="24"/>
+          <w:szCs w:val="24"/>
+          <w:lang w:val="es-ES"/>
+        </w:rPr>
+        <w:t xml:space="preserve"> el evaluara cual es el que coincide y dará como resultado su descripción y una recopilación de las características que se le dio.</w:t>
       </w:r>
       <w:r>
         <w:rPr>
@@ -2813,6 +3102,7 @@
         <w:lastRenderedPageBreak/>
         <w:t>“</w:t>
       </w:r>
+      <w:proofErr w:type="spellStart"/>
       <w:r>
         <w:rPr>
           <w:rFonts w:ascii="Times New Roman" w:hAnsi="Times New Roman" w:cs="Times New Roman"/>
@@ -2821,8 +3111,19 @@
           <w:szCs w:val="24"/>
           <w:lang w:val="es-ES"/>
         </w:rPr>
-        <w:t>Filumcopy.json</w:t>
-      </w:r>
+        <w:t>Phylum</w:t>
+      </w:r>
+      <w:r>
+        <w:rPr>
+          <w:rFonts w:ascii="Times New Roman" w:hAnsi="Times New Roman" w:cs="Times New Roman"/>
+          <w:b/>
+          <w:sz w:val="24"/>
+          <w:szCs w:val="24"/>
+          <w:lang w:val="es-ES"/>
+        </w:rPr>
+        <w:t>copy.json</w:t>
+      </w:r>
+      <w:proofErr w:type="spellEnd"/>
       <w:r>
         <w:rPr>
           <w:rFonts w:ascii="Times New Roman" w:hAnsi="Times New Roman" w:cs="Times New Roman"/>
@@ -3050,7 +3351,47 @@
           <w:szCs w:val="24"/>
           <w:lang w:val="es-ES"/>
         </w:rPr>
-        <w:t>Para agregar nuevos fílum, debes colocar una imagen en formato “png” o “jpg” dentro de esta carpeta. La imagen debe llevar el mismo nombre del fílum agregado.</w:t>
+        <w:t xml:space="preserve">Para agregar nuevos </w:t>
+      </w:r>
+      <w:proofErr w:type="spellStart"/>
+      <w:r>
+        <w:rPr>
+          <w:rFonts w:ascii="Times New Roman" w:hAnsi="Times New Roman" w:cs="Times New Roman"/>
+          <w:sz w:val="24"/>
+          <w:szCs w:val="24"/>
+          <w:lang w:val="es-ES"/>
+        </w:rPr>
+        <w:t>phylum</w:t>
+      </w:r>
+      <w:proofErr w:type="spellEnd"/>
+      <w:r>
+        <w:rPr>
+          <w:rFonts w:ascii="Times New Roman" w:hAnsi="Times New Roman" w:cs="Times New Roman"/>
+          <w:sz w:val="24"/>
+          <w:szCs w:val="24"/>
+          <w:lang w:val="es-ES"/>
+        </w:rPr>
+        <w:t xml:space="preserve">, debes colocar una imagen en formato “png” o “jpg” dentro de esta carpeta. La imagen debe llevar el mismo nombre del </w:t>
+      </w:r>
+      <w:proofErr w:type="spellStart"/>
+      <w:r>
+        <w:rPr>
+          <w:rFonts w:ascii="Times New Roman" w:hAnsi="Times New Roman" w:cs="Times New Roman"/>
+          <w:sz w:val="24"/>
+          <w:szCs w:val="24"/>
+          <w:lang w:val="es-ES"/>
+        </w:rPr>
+        <w:t>phylum</w:t>
+      </w:r>
+      <w:proofErr w:type="spellEnd"/>
+      <w:r>
+        <w:rPr>
+          <w:rFonts w:ascii="Times New Roman" w:hAnsi="Times New Roman" w:cs="Times New Roman"/>
+          <w:sz w:val="24"/>
+          <w:szCs w:val="24"/>
+          <w:lang w:val="es-ES"/>
+        </w:rPr>
+        <w:t xml:space="preserve"> agregado.</w:t>
       </w:r>
     </w:p>
     <w:p>
@@ -3065,6 +3406,8 @@
           <w:lang w:val="es-ES"/>
         </w:rPr>
       </w:pPr>
+      <w:bookmarkStart w:id="0" w:name="_GoBack"/>
+      <w:bookmarkEnd w:id="0"/>
     </w:p>
     <w:p>
       <w:pPr>
@@ -4421,7 +4764,7 @@
 </file>
 
 <file path=customXml/itemProps1.xml><?xml version="1.0" encoding="utf-8"?>
-<ds:datastoreItem xmlns:ds="http://schemas.openxmlformats.org/officeDocument/2006/customXml" ds:itemID="{AA837CFC-AE70-467E-B9DE-800EFEB0556B}">
+<ds:datastoreItem xmlns:ds="http://schemas.openxmlformats.org/officeDocument/2006/customXml" ds:itemID="{018A7144-BF98-4437-9349-A62FA8D19BB4}">
   <ds:schemaRefs>
     <ds:schemaRef ds:uri="http://schemas.openxmlformats.org/officeDocument/2006/bibliography"/>
   </ds:schemaRefs>

</xml_diff>